<commit_message>
Make CV contact details real clickable hyperlinks
Bug: CV PDF had ZERO hyperlinks. LinkedIn, portfolio, email, and phone
were rendered as plain text, so clicking them did nothing.

- PDF: <a href> on all four targets (reportlab builds /Annots link objects)
- DOCX: proper w:hyperlink elements with external relationships
- Verified: 4 clickable targets in both formats
</commit_message>
<xml_diff>
--- a/cv/CV_Aesen_Chavez_Hybrid.docx
+++ b/cv/CV_Aesen_Chavez_Hybrid.docx
@@ -43,23 +43,87 @@
           <w:i w:val="0"/>
           <w:sz w:val="17"/>
         </w:rPr>
-        <w:t>Muntinlupa City, Metro Manila  |  +63 947 245 0023  |  aesenchavez18@gmail.com</w:t>
+        <w:t>Muntinlupa City, Metro Manila</w:t>
       </w:r>
+      <w:r>
+        <w:rPr>
+          <w:rFonts w:ascii="Calibri" w:hAnsi="Calibri" w:eastAsia="Calibri"/>
+          <w:b w:val="0"/>
+          <w:i w:val="0"/>
+          <w:color w:val="888888"/>
+          <w:sz w:val="17"/>
+        </w:rPr>
+        <w:t xml:space="preserve">  |  </w:t>
+      </w:r>
+      <w:hyperlink r:id="rId9">
+        <w:r>
+          <w:rPr>
+            <w:rFonts w:ascii="Calibri" w:hAnsi="Calibri"/>
+            <w:color w:val="1F3864"/>
+            <w:sz w:val="17"/>
+            <w:u w:val="single"/>
+          </w:rPr>
+          <w:t xml:space="preserve">+63 947 245 0023</w:t>
+        </w:r>
+      </w:hyperlink>
+      <w:r>
+        <w:rPr>
+          <w:rFonts w:ascii="Calibri" w:hAnsi="Calibri" w:eastAsia="Calibri"/>
+          <w:b w:val="0"/>
+          <w:i w:val="0"/>
+          <w:color w:val="888888"/>
+          <w:sz w:val="17"/>
+        </w:rPr>
+        <w:t xml:space="preserve">  |  </w:t>
+      </w:r>
+      <w:hyperlink r:id="rId10">
+        <w:r>
+          <w:rPr>
+            <w:rFonts w:ascii="Calibri" w:hAnsi="Calibri"/>
+            <w:color w:val="1F3864"/>
+            <w:sz w:val="17"/>
+            <w:u w:val="single"/>
+          </w:rPr>
+          <w:t xml:space="preserve">aesenchavez18@gmail.com</w:t>
+        </w:r>
+      </w:hyperlink>
     </w:p>
     <w:p>
       <w:pPr>
         <w:spacing w:before="0" w:after="20" w:line="225" w:lineRule="exact"/>
       </w:pPr>
+      <w:hyperlink r:id="rId11">
+        <w:r>
+          <w:rPr>
+            <w:rFonts w:ascii="Calibri" w:hAnsi="Calibri"/>
+            <w:color w:val="1F3864"/>
+            <w:sz w:val="17"/>
+            <w:u w:val="single"/>
+          </w:rPr>
+          <w:t xml:space="preserve">linkedin.com/in/aesen-chavez-870b26343</w:t>
+        </w:r>
+      </w:hyperlink>
       <w:r>
         <w:rPr>
           <w:rFonts w:ascii="Calibri" w:hAnsi="Calibri" w:eastAsia="Calibri"/>
           <w:b w:val="0"/>
           <w:i w:val="0"/>
-          <w:color w:val="1F3864"/>
+          <w:color w:val="888888"/>
           <w:sz w:val="17"/>
         </w:rPr>
-        <w:t>linkedin.com/in/aesen-chavez-870b26343  |  aeseeen.github.io</w:t>
+        <w:t xml:space="preserve">  |  </w:t>
       </w:r>
+      <w:hyperlink r:id="rId12">
+        <w:r>
+          <w:rPr>
+            <w:rFonts w:ascii="Calibri" w:hAnsi="Calibri"/>
+            <w:color w:val="1F3864"/>
+            <w:sz w:val="17"/>
+            <w:u w:val="single"/>
+          </w:rPr>
+          <w:t xml:space="preserve">aeseeen.github.io</w:t>
+        </w:r>
+      </w:hyperlink>
     </w:p>
     <w:p>
       <w:pPr>

</xml_diff>